<commit_message>
EDT T1-T5 : recreation unique de 20 min, 10h20-10h40, volumes PE inchanges
Co-authored-by: arena-agent <297053741+arena-agent@users.noreply.github.com>
</commit_message>
<xml_diff>
--- a/EDT/emploi_du_temps_T1.docx
+++ b/EDT/emploi_du_temps_T1.docx
@@ -1636,7 +1636,7 @@
                 <w:i w:val="0"/>
                 <w:sz w:val="14"/>
               </w:rPr>
-              <w:t>9h 30 – 9h 40</w:t>
+              <w:t>9h 30 – 9h 50</w:t>
             </w:r>
           </w:p>
         </w:tc>
@@ -1644,7 +1644,6 @@
           <w:tcPr>
             <w:tcW w:type="dxa" w:w="1644"/>
             <w:vAlign w:val="center"/>
-            <w:shd w:val="clear" w:color="auto" w:fill="FFFF99"/>
           </w:tcPr>
           <w:p>
             <w:pPr>
@@ -1658,7 +1657,16 @@
                 <w:i w:val="0"/>
                 <w:sz w:val="14"/>
               </w:rPr>
-              <w:t>RÉCRÉATION</w:t>
+              <w:t>Malagasy – Vakiteny</w:t>
+            </w:r>
+            <w:r>
+              <w:rPr>
+                <w:rFonts w:ascii="Times New Roman" w:hAnsi="Times New Roman" w:cs="Times New Roman" w:eastAsia="Times New Roman"/>
+                <w:b w:val="0"/>
+                <w:color w:val="999999"/>
+                <w:sz w:val="10"/>
+              </w:rPr>
+              <w:t xml:space="preserve"> 2/9</w:t>
             </w:r>
           </w:p>
         </w:tc>
@@ -1666,7 +1674,6 @@
           <w:tcPr>
             <w:tcW w:type="dxa" w:w="1644"/>
             <w:vAlign w:val="center"/>
-            <w:shd w:val="clear" w:color="auto" w:fill="FFFF99"/>
           </w:tcPr>
           <w:p>
             <w:pPr>
@@ -1680,7 +1687,16 @@
                 <w:i w:val="0"/>
                 <w:sz w:val="14"/>
               </w:rPr>
-              <w:t>RÉCRÉATION</w:t>
+              <w:t>Malagasy – Vakiteny</w:t>
+            </w:r>
+            <w:r>
+              <w:rPr>
+                <w:rFonts w:ascii="Times New Roman" w:hAnsi="Times New Roman" w:cs="Times New Roman" w:eastAsia="Times New Roman"/>
+                <w:b w:val="0"/>
+                <w:color w:val="999999"/>
+                <w:sz w:val="10"/>
+              </w:rPr>
+              <w:t xml:space="preserve"> 4/9</w:t>
             </w:r>
           </w:p>
         </w:tc>
@@ -1688,7 +1704,6 @@
           <w:tcPr>
             <w:tcW w:type="dxa" w:w="1644"/>
             <w:vAlign w:val="center"/>
-            <w:shd w:val="clear" w:color="auto" w:fill="FFFF99"/>
           </w:tcPr>
           <w:p>
             <w:pPr>
@@ -1702,7 +1717,16 @@
                 <w:i w:val="0"/>
                 <w:sz w:val="14"/>
               </w:rPr>
-              <w:t>RÉCRÉATION</w:t>
+              <w:t>Malagasy – Vakiteny</w:t>
+            </w:r>
+            <w:r>
+              <w:rPr>
+                <w:rFonts w:ascii="Times New Roman" w:hAnsi="Times New Roman" w:cs="Times New Roman" w:eastAsia="Times New Roman"/>
+                <w:b w:val="0"/>
+                <w:color w:val="999999"/>
+                <w:sz w:val="10"/>
+              </w:rPr>
+              <w:t xml:space="preserve"> 6/9</w:t>
             </w:r>
           </w:p>
         </w:tc>
@@ -1710,7 +1734,6 @@
           <w:tcPr>
             <w:tcW w:type="dxa" w:w="1644"/>
             <w:vAlign w:val="center"/>
-            <w:shd w:val="clear" w:color="auto" w:fill="FFFF99"/>
           </w:tcPr>
           <w:p>
             <w:pPr>
@@ -1724,7 +1747,16 @@
                 <w:i w:val="0"/>
                 <w:sz w:val="14"/>
               </w:rPr>
-              <w:t>RÉCRÉATION</w:t>
+              <w:t>Malagasy – Vakiteny</w:t>
+            </w:r>
+            <w:r>
+              <w:rPr>
+                <w:rFonts w:ascii="Times New Roman" w:hAnsi="Times New Roman" w:cs="Times New Roman" w:eastAsia="Times New Roman"/>
+                <w:b w:val="0"/>
+                <w:color w:val="999999"/>
+                <w:sz w:val="10"/>
+              </w:rPr>
+              <w:t xml:space="preserve"> 8/9</w:t>
             </w:r>
           </w:p>
         </w:tc>
@@ -1732,7 +1764,6 @@
           <w:tcPr>
             <w:tcW w:type="dxa" w:w="1644"/>
             <w:vAlign w:val="center"/>
-            <w:shd w:val="clear" w:color="auto" w:fill="FFFF99"/>
           </w:tcPr>
           <w:p>
             <w:pPr>
@@ -1746,7 +1777,16 @@
                 <w:i w:val="0"/>
                 <w:sz w:val="14"/>
               </w:rPr>
-              <w:t>RÉCRÉATION</w:t>
+              <w:t>Malagasy – Fiasan'ny teny</w:t>
+            </w:r>
+            <w:r>
+              <w:rPr>
+                <w:rFonts w:ascii="Times New Roman" w:hAnsi="Times New Roman" w:cs="Times New Roman" w:eastAsia="Times New Roman"/>
+                <w:b w:val="0"/>
+                <w:color w:val="999999"/>
+                <w:sz w:val="10"/>
+              </w:rPr>
+              <w:t xml:space="preserve"> 9/9</w:t>
             </w:r>
           </w:p>
         </w:tc>
@@ -1819,228 +1859,7 @@
                 <w:i w:val="0"/>
                 <w:sz w:val="14"/>
               </w:rPr>
-              <w:t>9h 40 – 10h 00</w:t>
-            </w:r>
-          </w:p>
-        </w:tc>
-        <w:tc>
-          <w:tcPr>
-            <w:tcW w:type="dxa" w:w="1644"/>
-            <w:vAlign w:val="center"/>
-          </w:tcPr>
-          <w:p>
-            <w:pPr>
-              <w:jc w:val="center"/>
-              <w:spacing w:before="0" w:after="0" w:line="240" w:lineRule="auto"/>
-            </w:pPr>
-            <w:r>
-              <w:rPr>
-                <w:rFonts w:ascii="Times New Roman" w:hAnsi="Times New Roman" w:cs="Times New Roman" w:eastAsia="Times New Roman"/>
-                <w:b w:val="0"/>
-                <w:i w:val="0"/>
-                <w:sz w:val="14"/>
-              </w:rPr>
-              <w:t>Malagasy – Vakiteny</w:t>
-            </w:r>
-            <w:r>
-              <w:rPr>
-                <w:rFonts w:ascii="Times New Roman" w:hAnsi="Times New Roman" w:cs="Times New Roman" w:eastAsia="Times New Roman"/>
-                <w:b w:val="0"/>
-                <w:color w:val="999999"/>
-                <w:sz w:val="10"/>
-              </w:rPr>
-              <w:t xml:space="preserve"> 2/9</w:t>
-            </w:r>
-          </w:p>
-        </w:tc>
-        <w:tc>
-          <w:tcPr>
-            <w:tcW w:type="dxa" w:w="1644"/>
-            <w:vAlign w:val="center"/>
-          </w:tcPr>
-          <w:p>
-            <w:pPr>
-              <w:jc w:val="center"/>
-              <w:spacing w:before="0" w:after="0" w:line="240" w:lineRule="auto"/>
-            </w:pPr>
-            <w:r>
-              <w:rPr>
-                <w:rFonts w:ascii="Times New Roman" w:hAnsi="Times New Roman" w:cs="Times New Roman" w:eastAsia="Times New Roman"/>
-                <w:b w:val="0"/>
-                <w:i w:val="0"/>
-                <w:sz w:val="14"/>
-              </w:rPr>
-              <w:t>Malagasy – Vakiteny</w:t>
-            </w:r>
-            <w:r>
-              <w:rPr>
-                <w:rFonts w:ascii="Times New Roman" w:hAnsi="Times New Roman" w:cs="Times New Roman" w:eastAsia="Times New Roman"/>
-                <w:b w:val="0"/>
-                <w:color w:val="999999"/>
-                <w:sz w:val="10"/>
-              </w:rPr>
-              <w:t xml:space="preserve"> 4/9</w:t>
-            </w:r>
-          </w:p>
-        </w:tc>
-        <w:tc>
-          <w:tcPr>
-            <w:tcW w:type="dxa" w:w="1644"/>
-            <w:vAlign w:val="center"/>
-          </w:tcPr>
-          <w:p>
-            <w:pPr>
-              <w:jc w:val="center"/>
-              <w:spacing w:before="0" w:after="0" w:line="240" w:lineRule="auto"/>
-            </w:pPr>
-            <w:r>
-              <w:rPr>
-                <w:rFonts w:ascii="Times New Roman" w:hAnsi="Times New Roman" w:cs="Times New Roman" w:eastAsia="Times New Roman"/>
-                <w:b w:val="0"/>
-                <w:i w:val="0"/>
-                <w:sz w:val="14"/>
-              </w:rPr>
-              <w:t>Malagasy – Vakiteny</w:t>
-            </w:r>
-            <w:r>
-              <w:rPr>
-                <w:rFonts w:ascii="Times New Roman" w:hAnsi="Times New Roman" w:cs="Times New Roman" w:eastAsia="Times New Roman"/>
-                <w:b w:val="0"/>
-                <w:color w:val="999999"/>
-                <w:sz w:val="10"/>
-              </w:rPr>
-              <w:t xml:space="preserve"> 6/9</w:t>
-            </w:r>
-          </w:p>
-        </w:tc>
-        <w:tc>
-          <w:tcPr>
-            <w:tcW w:type="dxa" w:w="1644"/>
-            <w:vAlign w:val="center"/>
-          </w:tcPr>
-          <w:p>
-            <w:pPr>
-              <w:jc w:val="center"/>
-              <w:spacing w:before="0" w:after="0" w:line="240" w:lineRule="auto"/>
-            </w:pPr>
-            <w:r>
-              <w:rPr>
-                <w:rFonts w:ascii="Times New Roman" w:hAnsi="Times New Roman" w:cs="Times New Roman" w:eastAsia="Times New Roman"/>
-                <w:b w:val="0"/>
-                <w:i w:val="0"/>
-                <w:sz w:val="14"/>
-              </w:rPr>
-              <w:t>Malagasy – Vakiteny</w:t>
-            </w:r>
-            <w:r>
-              <w:rPr>
-                <w:rFonts w:ascii="Times New Roman" w:hAnsi="Times New Roman" w:cs="Times New Roman" w:eastAsia="Times New Roman"/>
-                <w:b w:val="0"/>
-                <w:color w:val="999999"/>
-                <w:sz w:val="10"/>
-              </w:rPr>
-              <w:t xml:space="preserve"> 8/9</w:t>
-            </w:r>
-          </w:p>
-        </w:tc>
-        <w:tc>
-          <w:tcPr>
-            <w:tcW w:type="dxa" w:w="1644"/>
-            <w:vAlign w:val="center"/>
-          </w:tcPr>
-          <w:p>
-            <w:pPr>
-              <w:jc w:val="center"/>
-              <w:spacing w:before="0" w:after="0" w:line="240" w:lineRule="auto"/>
-            </w:pPr>
-            <w:r>
-              <w:rPr>
-                <w:rFonts w:ascii="Times New Roman" w:hAnsi="Times New Roman" w:cs="Times New Roman" w:eastAsia="Times New Roman"/>
-                <w:b w:val="0"/>
-                <w:i w:val="0"/>
-                <w:sz w:val="14"/>
-              </w:rPr>
-              <w:t>Malagasy – Fiasan'ny teny</w:t>
-            </w:r>
-            <w:r>
-              <w:rPr>
-                <w:rFonts w:ascii="Times New Roman" w:hAnsi="Times New Roman" w:cs="Times New Roman" w:eastAsia="Times New Roman"/>
-                <w:b w:val="0"/>
-                <w:color w:val="999999"/>
-                <w:sz w:val="10"/>
-              </w:rPr>
-              <w:t xml:space="preserve"> 9/9</w:t>
-            </w:r>
-          </w:p>
-        </w:tc>
-        <w:tc>
-          <w:tcPr>
-            <w:tcW w:type="dxa" w:w="113"/>
-            <w:shd w:val="clear" w:color="auto" w:fill="FFFFFF"/>
-          </w:tcPr>
-          <w:p/>
-        </w:tc>
-        <w:tc>
-          <w:tcPr>
-            <w:tcW w:type="dxa" w:w="1190"/>
-            <w:vAlign w:val="center"/>
-          </w:tcPr>
-          <w:p>
-            <w:pPr>
-              <w:jc w:val="left"/>
-              <w:spacing w:before="0" w:after="0" w:line="240" w:lineRule="auto"/>
-            </w:pPr>
-            <w:r>
-              <w:rPr>
-                <w:rFonts w:ascii="Times New Roman" w:hAnsi="Times New Roman" w:cs="Times New Roman" w:eastAsia="Times New Roman"/>
-                <w:b w:val="0"/>
-                <w:i w:val="0"/>
-                <w:sz w:val="14"/>
-              </w:rPr>
-            </w:r>
-          </w:p>
-        </w:tc>
-        <w:tc>
-          <w:tcPr>
-            <w:tcW w:type="dxa" w:w="3344"/>
-            <w:vAlign w:val="center"/>
-          </w:tcPr>
-          <w:p>
-            <w:pPr>
-              <w:jc w:val="left"/>
-              <w:spacing w:before="0" w:after="0" w:line="240" w:lineRule="auto"/>
-            </w:pPr>
-            <w:r>
-              <w:rPr>
-                <w:rFonts w:ascii="Times New Roman" w:hAnsi="Times New Roman" w:cs="Times New Roman" w:eastAsia="Times New Roman"/>
-                <w:b w:val="0"/>
-                <w:i w:val="0"/>
-                <w:sz w:val="13"/>
-              </w:rPr>
-            </w:r>
-          </w:p>
-        </w:tc>
-      </w:tr>
-      <w:tr>
-        <w:tc>
-          <w:tcPr>
-            <w:tcW w:type="dxa" w:w="1133"/>
-            <w:vAlign w:val="center"/>
-            <w:shd w:val="clear" w:color="auto" w:fill="6DFFE3"/>
-          </w:tcPr>
-          <w:p>
-            <w:pPr>
-              <w:jc w:val="center"/>
-              <w:spacing w:before="0" w:after="0" w:line="240" w:lineRule="auto"/>
-            </w:pPr>
-            <w:r>
-              <w:rPr>
-                <w:rFonts w:ascii="Times New Roman" w:hAnsi="Times New Roman" w:cs="Times New Roman" w:eastAsia="Times New Roman"/>
-                <w:b/>
-                <w:i w:val="0"/>
-                <w:sz w:val="14"/>
-              </w:rPr>
-              <w:t>10h 00 – 10h 30</w:t>
+              <w:t>9h 50 – 10h 20</w:t>
             </w:r>
           </w:p>
         </w:tc>
@@ -2261,7 +2080,188 @@
                 <w:i w:val="0"/>
                 <w:sz w:val="14"/>
               </w:rPr>
-              <w:t>10h 30 – 10h 50</w:t>
+              <w:t>10h 20 – 10h 40</w:t>
+            </w:r>
+          </w:p>
+        </w:tc>
+        <w:tc>
+          <w:tcPr>
+            <w:tcW w:type="dxa" w:w="1644"/>
+            <w:vAlign w:val="center"/>
+            <w:shd w:val="clear" w:color="auto" w:fill="FFFF99"/>
+          </w:tcPr>
+          <w:p>
+            <w:pPr>
+              <w:jc w:val="center"/>
+              <w:spacing w:before="0" w:after="0" w:line="240" w:lineRule="auto"/>
+            </w:pPr>
+            <w:r>
+              <w:rPr>
+                <w:rFonts w:ascii="Times New Roman" w:hAnsi="Times New Roman" w:cs="Times New Roman" w:eastAsia="Times New Roman"/>
+                <w:b w:val="0"/>
+                <w:i w:val="0"/>
+                <w:sz w:val="14"/>
+              </w:rPr>
+              <w:t>RÉCRÉATION</w:t>
+            </w:r>
+          </w:p>
+        </w:tc>
+        <w:tc>
+          <w:tcPr>
+            <w:tcW w:type="dxa" w:w="1644"/>
+            <w:vAlign w:val="center"/>
+            <w:shd w:val="clear" w:color="auto" w:fill="FFFF99"/>
+          </w:tcPr>
+          <w:p>
+            <w:pPr>
+              <w:jc w:val="center"/>
+              <w:spacing w:before="0" w:after="0" w:line="240" w:lineRule="auto"/>
+            </w:pPr>
+            <w:r>
+              <w:rPr>
+                <w:rFonts w:ascii="Times New Roman" w:hAnsi="Times New Roman" w:cs="Times New Roman" w:eastAsia="Times New Roman"/>
+                <w:b w:val="0"/>
+                <w:i w:val="0"/>
+                <w:sz w:val="14"/>
+              </w:rPr>
+              <w:t>RÉCRÉATION</w:t>
+            </w:r>
+          </w:p>
+        </w:tc>
+        <w:tc>
+          <w:tcPr>
+            <w:tcW w:type="dxa" w:w="1644"/>
+            <w:vAlign w:val="center"/>
+            <w:shd w:val="clear" w:color="auto" w:fill="FFFF99"/>
+          </w:tcPr>
+          <w:p>
+            <w:pPr>
+              <w:jc w:val="center"/>
+              <w:spacing w:before="0" w:after="0" w:line="240" w:lineRule="auto"/>
+            </w:pPr>
+            <w:r>
+              <w:rPr>
+                <w:rFonts w:ascii="Times New Roman" w:hAnsi="Times New Roman" w:cs="Times New Roman" w:eastAsia="Times New Roman"/>
+                <w:b w:val="0"/>
+                <w:i w:val="0"/>
+                <w:sz w:val="14"/>
+              </w:rPr>
+              <w:t>RÉCRÉATION</w:t>
+            </w:r>
+          </w:p>
+        </w:tc>
+        <w:tc>
+          <w:tcPr>
+            <w:tcW w:type="dxa" w:w="1644"/>
+            <w:vAlign w:val="center"/>
+            <w:shd w:val="clear" w:color="auto" w:fill="FFFF99"/>
+          </w:tcPr>
+          <w:p>
+            <w:pPr>
+              <w:jc w:val="center"/>
+              <w:spacing w:before="0" w:after="0" w:line="240" w:lineRule="auto"/>
+            </w:pPr>
+            <w:r>
+              <w:rPr>
+                <w:rFonts w:ascii="Times New Roman" w:hAnsi="Times New Roman" w:cs="Times New Roman" w:eastAsia="Times New Roman"/>
+                <w:b w:val="0"/>
+                <w:i w:val="0"/>
+                <w:sz w:val="14"/>
+              </w:rPr>
+              <w:t>RÉCRÉATION</w:t>
+            </w:r>
+          </w:p>
+        </w:tc>
+        <w:tc>
+          <w:tcPr>
+            <w:tcW w:type="dxa" w:w="1644"/>
+            <w:vAlign w:val="center"/>
+            <w:shd w:val="clear" w:color="auto" w:fill="FFFF99"/>
+          </w:tcPr>
+          <w:p>
+            <w:pPr>
+              <w:jc w:val="center"/>
+              <w:spacing w:before="0" w:after="0" w:line="240" w:lineRule="auto"/>
+            </w:pPr>
+            <w:r>
+              <w:rPr>
+                <w:rFonts w:ascii="Times New Roman" w:hAnsi="Times New Roman" w:cs="Times New Roman" w:eastAsia="Times New Roman"/>
+                <w:b w:val="0"/>
+                <w:i w:val="0"/>
+                <w:sz w:val="14"/>
+              </w:rPr>
+              <w:t>RÉCRÉATION</w:t>
+            </w:r>
+          </w:p>
+        </w:tc>
+        <w:tc>
+          <w:tcPr>
+            <w:tcW w:type="dxa" w:w="113"/>
+            <w:shd w:val="clear" w:color="auto" w:fill="FFFFFF"/>
+          </w:tcPr>
+          <w:p/>
+        </w:tc>
+        <w:tc>
+          <w:tcPr>
+            <w:tcW w:type="dxa" w:w="1190"/>
+            <w:vAlign w:val="center"/>
+          </w:tcPr>
+          <w:p>
+            <w:pPr>
+              <w:jc w:val="left"/>
+              <w:spacing w:before="0" w:after="0" w:line="240" w:lineRule="auto"/>
+            </w:pPr>
+            <w:r>
+              <w:rPr>
+                <w:rFonts w:ascii="Times New Roman" w:hAnsi="Times New Roman" w:cs="Times New Roman" w:eastAsia="Times New Roman"/>
+                <w:b w:val="0"/>
+                <w:i w:val="0"/>
+                <w:sz w:val="14"/>
+              </w:rPr>
+            </w:r>
+          </w:p>
+        </w:tc>
+        <w:tc>
+          <w:tcPr>
+            <w:tcW w:type="dxa" w:w="3344"/>
+            <w:vAlign w:val="center"/>
+          </w:tcPr>
+          <w:p>
+            <w:pPr>
+              <w:jc w:val="left"/>
+              <w:spacing w:before="0" w:after="0" w:line="240" w:lineRule="auto"/>
+            </w:pPr>
+            <w:r>
+              <w:rPr>
+                <w:rFonts w:ascii="Times New Roman" w:hAnsi="Times New Roman" w:cs="Times New Roman" w:eastAsia="Times New Roman"/>
+                <w:b w:val="0"/>
+                <w:i w:val="0"/>
+                <w:sz w:val="13"/>
+              </w:rPr>
+            </w:r>
+          </w:p>
+        </w:tc>
+      </w:tr>
+      <w:tr>
+        <w:tc>
+          <w:tcPr>
+            <w:tcW w:type="dxa" w:w="1133"/>
+            <w:vAlign w:val="center"/>
+            <w:shd w:val="clear" w:color="auto" w:fill="6DFFE3"/>
+          </w:tcPr>
+          <w:p>
+            <w:pPr>
+              <w:jc w:val="center"/>
+              <w:spacing w:before="0" w:after="0" w:line="240" w:lineRule="auto"/>
+            </w:pPr>
+            <w:r>
+              <w:rPr>
+                <w:rFonts w:ascii="Times New Roman" w:hAnsi="Times New Roman" w:cs="Times New Roman" w:eastAsia="Times New Roman"/>
+                <w:b/>
+                <w:i w:val="0"/>
+                <w:sz w:val="14"/>
+              </w:rPr>
+              <w:t>10h 40 – 11h 00</w:t>
             </w:r>
           </w:p>
         </w:tc>
@@ -2482,7 +2482,7 @@
                 <w:i w:val="0"/>
                 <w:sz w:val="14"/>
               </w:rPr>
-              <w:t>10h 50 – 11h 20</w:t>
+              <w:t>11h 00 – 11h 30</w:t>
             </w:r>
           </w:p>
         </w:tc>
@@ -2690,187 +2690,6 @@
             <w:tcW w:type="dxa" w:w="1133"/>
             <w:vAlign w:val="center"/>
             <w:shd w:val="clear" w:color="auto" w:fill="6DFFE3"/>
-          </w:tcPr>
-          <w:p>
-            <w:pPr>
-              <w:jc w:val="center"/>
-              <w:spacing w:before="0" w:after="0" w:line="240" w:lineRule="auto"/>
-            </w:pPr>
-            <w:r>
-              <w:rPr>
-                <w:rFonts w:ascii="Times New Roman" w:hAnsi="Times New Roman" w:cs="Times New Roman" w:eastAsia="Times New Roman"/>
-                <w:b/>
-                <w:i w:val="0"/>
-                <w:sz w:val="14"/>
-              </w:rPr>
-              <w:t>11h 20 – 11h 30</w:t>
-            </w:r>
-          </w:p>
-        </w:tc>
-        <w:tc>
-          <w:tcPr>
-            <w:tcW w:type="dxa" w:w="1644"/>
-            <w:vAlign w:val="center"/>
-            <w:shd w:val="clear" w:color="auto" w:fill="FFFF99"/>
-          </w:tcPr>
-          <w:p>
-            <w:pPr>
-              <w:jc w:val="center"/>
-              <w:spacing w:before="0" w:after="0" w:line="240" w:lineRule="auto"/>
-            </w:pPr>
-            <w:r>
-              <w:rPr>
-                <w:rFonts w:ascii="Times New Roman" w:hAnsi="Times New Roman" w:cs="Times New Roman" w:eastAsia="Times New Roman"/>
-                <w:b w:val="0"/>
-                <w:i w:val="0"/>
-                <w:sz w:val="14"/>
-              </w:rPr>
-              <w:t>RÉCRÉATION</w:t>
-            </w:r>
-          </w:p>
-        </w:tc>
-        <w:tc>
-          <w:tcPr>
-            <w:tcW w:type="dxa" w:w="1644"/>
-            <w:vAlign w:val="center"/>
-            <w:shd w:val="clear" w:color="auto" w:fill="FFFF99"/>
-          </w:tcPr>
-          <w:p>
-            <w:pPr>
-              <w:jc w:val="center"/>
-              <w:spacing w:before="0" w:after="0" w:line="240" w:lineRule="auto"/>
-            </w:pPr>
-            <w:r>
-              <w:rPr>
-                <w:rFonts w:ascii="Times New Roman" w:hAnsi="Times New Roman" w:cs="Times New Roman" w:eastAsia="Times New Roman"/>
-                <w:b w:val="0"/>
-                <w:i w:val="0"/>
-                <w:sz w:val="14"/>
-              </w:rPr>
-              <w:t>RÉCRÉATION</w:t>
-            </w:r>
-          </w:p>
-        </w:tc>
-        <w:tc>
-          <w:tcPr>
-            <w:tcW w:type="dxa" w:w="1644"/>
-            <w:vAlign w:val="center"/>
-            <w:shd w:val="clear" w:color="auto" w:fill="FFFF99"/>
-          </w:tcPr>
-          <w:p>
-            <w:pPr>
-              <w:jc w:val="center"/>
-              <w:spacing w:before="0" w:after="0" w:line="240" w:lineRule="auto"/>
-            </w:pPr>
-            <w:r>
-              <w:rPr>
-                <w:rFonts w:ascii="Times New Roman" w:hAnsi="Times New Roman" w:cs="Times New Roman" w:eastAsia="Times New Roman"/>
-                <w:b w:val="0"/>
-                <w:i w:val="0"/>
-                <w:sz w:val="14"/>
-              </w:rPr>
-              <w:t>RÉCRÉATION</w:t>
-            </w:r>
-          </w:p>
-        </w:tc>
-        <w:tc>
-          <w:tcPr>
-            <w:tcW w:type="dxa" w:w="1644"/>
-            <w:vAlign w:val="center"/>
-            <w:shd w:val="clear" w:color="auto" w:fill="FFFF99"/>
-          </w:tcPr>
-          <w:p>
-            <w:pPr>
-              <w:jc w:val="center"/>
-              <w:spacing w:before="0" w:after="0" w:line="240" w:lineRule="auto"/>
-            </w:pPr>
-            <w:r>
-              <w:rPr>
-                <w:rFonts w:ascii="Times New Roman" w:hAnsi="Times New Roman" w:cs="Times New Roman" w:eastAsia="Times New Roman"/>
-                <w:b w:val="0"/>
-                <w:i w:val="0"/>
-                <w:sz w:val="14"/>
-              </w:rPr>
-              <w:t>RÉCRÉATION</w:t>
-            </w:r>
-          </w:p>
-        </w:tc>
-        <w:tc>
-          <w:tcPr>
-            <w:tcW w:type="dxa" w:w="1644"/>
-            <w:vAlign w:val="center"/>
-            <w:shd w:val="clear" w:color="auto" w:fill="FFFF99"/>
-          </w:tcPr>
-          <w:p>
-            <w:pPr>
-              <w:jc w:val="center"/>
-              <w:spacing w:before="0" w:after="0" w:line="240" w:lineRule="auto"/>
-            </w:pPr>
-            <w:r>
-              <w:rPr>
-                <w:rFonts w:ascii="Times New Roman" w:hAnsi="Times New Roman" w:cs="Times New Roman" w:eastAsia="Times New Roman"/>
-                <w:b w:val="0"/>
-                <w:i w:val="0"/>
-                <w:sz w:val="14"/>
-              </w:rPr>
-              <w:t>RÉCRÉATION</w:t>
-            </w:r>
-          </w:p>
-        </w:tc>
-        <w:tc>
-          <w:tcPr>
-            <w:tcW w:type="dxa" w:w="113"/>
-            <w:shd w:val="clear" w:color="auto" w:fill="FFFFFF"/>
-          </w:tcPr>
-          <w:p/>
-        </w:tc>
-        <w:tc>
-          <w:tcPr>
-            <w:tcW w:type="dxa" w:w="1190"/>
-            <w:vAlign w:val="center"/>
-          </w:tcPr>
-          <w:p>
-            <w:pPr>
-              <w:jc w:val="left"/>
-              <w:spacing w:before="0" w:after="0" w:line="240" w:lineRule="auto"/>
-            </w:pPr>
-            <w:r>
-              <w:rPr>
-                <w:rFonts w:ascii="Times New Roman" w:hAnsi="Times New Roman" w:cs="Times New Roman" w:eastAsia="Times New Roman"/>
-                <w:b w:val="0"/>
-                <w:i w:val="0"/>
-                <w:sz w:val="14"/>
-              </w:rPr>
-            </w:r>
-          </w:p>
-        </w:tc>
-        <w:tc>
-          <w:tcPr>
-            <w:tcW w:type="dxa" w:w="3344"/>
-            <w:vAlign w:val="center"/>
-          </w:tcPr>
-          <w:p>
-            <w:pPr>
-              <w:jc w:val="left"/>
-              <w:spacing w:before="0" w:after="0" w:line="240" w:lineRule="auto"/>
-            </w:pPr>
-            <w:r>
-              <w:rPr>
-                <w:rFonts w:ascii="Times New Roman" w:hAnsi="Times New Roman" w:cs="Times New Roman" w:eastAsia="Times New Roman"/>
-                <w:b w:val="0"/>
-                <w:i w:val="0"/>
-                <w:sz w:val="13"/>
-              </w:rPr>
-            </w:r>
-          </w:p>
-        </w:tc>
-      </w:tr>
-      <w:tr>
-        <w:tc>
-          <w:tcPr>
-            <w:tcW w:type="dxa" w:w="1133"/>
-            <w:vAlign w:val="center"/>
-            <w:shd w:val="clear" w:color="auto" w:fill="AB7800"/>
           </w:tcPr>
           <w:p>
             <w:pPr>
@@ -3264,13 +3083,7 @@
             <w:tcW w:type="dxa" w:w="113"/>
             <w:shd w:val="clear" w:color="auto" w:fill="FFFFFF"/>
           </w:tcPr>
-          <w:p>
-            <w:r>
-              <w:rPr>
-                <w:rFonts w:ascii="Times New Roman" w:hAnsi="Times New Roman" w:cs="Times New Roman" w:eastAsia="Times New Roman"/>
-              </w:rPr>
-            </w:r>
-          </w:p>
+          <w:p/>
         </w:tc>
         <w:tc>
           <w:tcPr>
@@ -3855,7 +3668,7 @@
                 <w:i w:val="0"/>
                 <w:sz w:val="13"/>
               </w:rPr>
-              <w:t>1h 40 min (100 min) = 10 min × 2 × 5</w:t>
+              <w:t>1h 40 min (100 min) = 20 min × 5</w:t>
             </w:r>
           </w:p>
         </w:tc>

</xml_diff>